<commit_message>
Final JAGST submission: new title, JAGST formatting (Calibri 11, single spacing), abstract <300 words, alphabetical citations, expanded response letter
Co-Authored-By: Claude Opus 5.5 <noreply@anthropic.com>
Claude-Session: https://claude.ai/code/session_01HHipd8ZuVXSy6vXHFwKc2n
</commit_message>
<xml_diff>
--- a/src/ms/reference.docx
+++ b/src/ms/reference.docx
@@ -548,9 +548,9 @@
   <w:docDefaults>
     <w:rPrDefault>
       <w:rPr>
-        <w:rFonts w:asciiTheme="minorHAnsi" w:eastAsiaTheme="minorHAnsi" w:hAnsiTheme="minorHAnsi" w:cstheme="minorBidi"/>
-        <w:sz w:val="24"/>
-        <w:szCs w:val="24"/>
+        <w:rFonts w:ascii="Calibri" w:hAnsi="Calibri" w:cs="Calibri" w:eastAsia="Calibri"/>
+        <w:sz w:val="22"/>
+        <w:szCs w:val="22"/>
         <w:lang w:val="en-US" w:eastAsia="en-US" w:bidi="ar-SA"/>
       </w:rPr>
     </w:rPrDefault>
@@ -565,12 +565,12 @@
     <w:name w:val="Normal"/>
     <w:qFormat/>
     <w:pPr>
-      <w:spacing w:line="480" w:lineRule="auto" w:after="120" w:before="0"/>
-    </w:pPr>
-    <w:rPr>
-      <w:rFonts w:ascii="Times New Roman" w:hAnsi="Times New Roman" w:cs="Times New Roman" w:eastAsia="Times New Roman"/>
-      <w:color w:val="000000"/>
-      <w:sz w:val="24"/>
+      <w:spacing w:line="240" w:lineRule="auto" w:after="120" w:before="0"/>
+    </w:pPr>
+    <w:rPr>
+      <w:rFonts w:ascii="Calibri" w:hAnsi="Calibri" w:cs="Calibri" w:eastAsia="Calibri"/>
+      <w:color w:val="000000"/>
+      <w:sz w:val="22"/>
     </w:rPr>
   </w:style>
   <w:style w:type="paragraph" w:styleId="BodyText">
@@ -578,13 +578,13 @@
     <w:basedOn w:val="Normal"/>
     <w:link w:val="BodyTextChar"/>
     <w:pPr>
-      <w:spacing w:before="0" w:after="120" w:line="480" w:lineRule="auto"/>
-    </w:pPr>
-    <w:qFormat/>
-    <w:rPr>
-      <w:rFonts w:ascii="Times New Roman" w:hAnsi="Times New Roman" w:cs="Times New Roman" w:eastAsia="Times New Roman"/>
-      <w:color w:val="000000"/>
-      <w:sz w:val="24"/>
+      <w:spacing w:before="0" w:after="120" w:line="240" w:lineRule="auto"/>
+    </w:pPr>
+    <w:qFormat/>
+    <w:rPr>
+      <w:rFonts w:ascii="Calibri" w:hAnsi="Calibri" w:cs="Calibri" w:eastAsia="Calibri"/>
+      <w:color w:val="000000"/>
+      <w:sz w:val="22"/>
     </w:rPr>
   </w:style>
   <w:style w:type="paragraph" w:customStyle="1" w:styleId="FirstParagraph">
@@ -593,12 +593,12 @@
     <w:next w:val="BodyText"/>
     <w:qFormat/>
     <w:pPr>
-      <w:spacing w:line="480" w:lineRule="auto" w:after="120" w:before="0"/>
-    </w:pPr>
-    <w:rPr>
-      <w:rFonts w:ascii="Times New Roman" w:hAnsi="Times New Roman" w:cs="Times New Roman" w:eastAsia="Times New Roman"/>
-      <w:color w:val="000000"/>
-      <w:sz w:val="24"/>
+      <w:spacing w:line="240" w:lineRule="auto" w:after="120" w:before="0"/>
+    </w:pPr>
+    <w:rPr>
+      <w:rFonts w:ascii="Calibri" w:hAnsi="Calibri" w:cs="Calibri" w:eastAsia="Calibri"/>
+      <w:color w:val="000000"/>
+      <w:sz w:val="22"/>
     </w:rPr>
   </w:style>
   <w:style w:type="paragraph" w:customStyle="1" w:styleId="Compact">
@@ -609,9 +609,9 @@
       <w:spacing w:before="0" w:after="0" w:line="240" w:lineRule="auto"/>
     </w:pPr>
     <w:rPr>
-      <w:rFonts w:ascii="Times New Roman" w:hAnsi="Times New Roman" w:cs="Times New Roman" w:eastAsia="Times New Roman"/>
-      <w:color w:val="000000"/>
-      <w:sz w:val="20"/>
+      <w:rFonts w:ascii="Calibri" w:hAnsi="Calibri" w:cs="Calibri" w:eastAsia="Calibri"/>
+      <w:color w:val="000000"/>
+      <w:sz w:val="18"/>
     </w:rPr>
   </w:style>
   <w:style w:type="paragraph" w:styleId="Title">
@@ -622,17 +622,17 @@
     <w:pPr>
       <w:keepNext/>
       <w:keepLines/>
-      <w:spacing w:before="240" w:after="120" w:line="480" w:lineRule="auto"/>
+      <w:spacing w:before="240" w:after="120" w:line="240" w:lineRule="auto"/>
       <w:jc w:val="center"/>
     </w:pPr>
     <w:rPr>
-      <w:rFonts w:ascii="Times New Roman" w:hAnsi="Times New Roman" w:cs="Times New Roman" w:eastAsia="Times New Roman"/>
+      <w:rFonts w:ascii="Calibri" w:hAnsi="Calibri" w:cs="Calibri" w:eastAsia="Calibri"/>
       <w:b/>
       <w:bCs/>
       <w:i w:val="0"/>
       <w:color w:val="000000"/>
       <w:sz w:val="28"/>
-      <w:szCs w:val="36"/>
+      <w:szCs w:val="28"/>
     </w:rPr>
   </w:style>
   <w:style w:type="paragraph" w:styleId="Subtitle">
@@ -643,16 +643,16 @@
     <w:pPr>
       <w:keepNext/>
       <w:keepLines/>
-      <w:spacing w:before="240" w:after="120" w:line="480" w:lineRule="auto"/>
+      <w:spacing w:before="240" w:after="120" w:line="240" w:lineRule="auto"/>
       <w:jc w:val="center"/>
     </w:pPr>
     <w:rPr>
-      <w:rFonts w:ascii="Times New Roman" w:hAnsi="Times New Roman" w:cs="Times New Roman" w:eastAsia="Times New Roman"/>
+      <w:rFonts w:ascii="Calibri" w:hAnsi="Calibri" w:cs="Calibri" w:eastAsia="Calibri"/>
       <w:b/>
       <w:i w:val="0"/>
       <w:color w:val="000000"/>
       <w:sz w:val="24"/>
-      <w:szCs w:val="30"/>
+      <w:szCs w:val="24"/>
     </w:rPr>
   </w:style>
   <w:style w:type="paragraph" w:customStyle="1" w:styleId="Author">
@@ -665,7 +665,7 @@
       <w:jc w:val="center"/>
     </w:pPr>
     <w:rPr>
-      <w:rFonts w:ascii="Times New Roman" w:hAnsi="Times New Roman" w:cs="Times New Roman" w:eastAsia="Times New Roman"/>
+      <w:rFonts w:ascii="Calibri" w:hAnsi="Calibri" w:cs="Calibri" w:eastAsia="Calibri"/>
       <w:color w:val="000000"/>
     </w:rPr>
   </w:style>
@@ -679,7 +679,7 @@
       <w:jc w:val="center"/>
     </w:pPr>
     <w:rPr>
-      <w:rFonts w:ascii="Times New Roman" w:hAnsi="Times New Roman" w:cs="Times New Roman" w:eastAsia="Times New Roman"/>
+      <w:rFonts w:ascii="Calibri" w:hAnsi="Calibri" w:cs="Calibri" w:eastAsia="Calibri"/>
       <w:color w:val="000000"/>
     </w:rPr>
   </w:style>
@@ -696,9 +696,9 @@
     </w:pPr>
     <w:rPr>
       <w:color w:val="000000"/>
-      <w:sz w:val="20"/>
-      <w:szCs w:val="20"/>
-      <w:rFonts w:ascii="Times New Roman" w:hAnsi="Times New Roman" w:cs="Times New Roman" w:eastAsia="Times New Roman"/>
+      <w:sz w:val="22"/>
+      <w:szCs w:val="22"/>
+      <w:rFonts w:ascii="Calibri" w:hAnsi="Calibri" w:cs="Calibri" w:eastAsia="Calibri"/>
       <w:b/>
     </w:rPr>
   </w:style>
@@ -713,10 +713,10 @@
       <w:spacing w:before="100" w:after="300"/>
     </w:pPr>
     <w:rPr>
-      <w:rFonts w:ascii="Times New Roman" w:hAnsi="Times New Roman" w:cs="Times New Roman" w:eastAsia="Times New Roman"/>
-      <w:color w:val="000000"/>
-      <w:sz w:val="20"/>
-      <w:szCs w:val="20"/>
+      <w:rFonts w:ascii="Calibri" w:hAnsi="Calibri" w:cs="Calibri" w:eastAsia="Calibri"/>
+      <w:color w:val="000000"/>
+      <w:sz w:val="22"/>
+      <w:szCs w:val="22"/>
     </w:rPr>
   </w:style>
   <w:style w:type="paragraph" w:styleId="Bibliography">
@@ -726,7 +726,7 @@
     <w:qFormat/>
     <w:pPr/>
     <w:rPr>
-      <w:rFonts w:ascii="Times New Roman" w:hAnsi="Times New Roman" w:cs="Times New Roman" w:eastAsia="Times New Roman"/>
+      <w:rFonts w:ascii="Calibri" w:hAnsi="Calibri" w:cs="Calibri" w:eastAsia="Calibri"/>
       <w:color w:val="000000"/>
     </w:rPr>
   </w:style>
@@ -743,12 +743,12 @@
       <w:outlineLvl w:val="0"/>
     </w:pPr>
     <w:rPr>
-      <w:rFonts w:ascii="Times New Roman" w:hAnsi="Times New Roman" w:cs="Times New Roman" w:eastAsia="Times New Roman"/>
+      <w:rFonts w:ascii="Calibri" w:hAnsi="Calibri" w:cs="Calibri" w:eastAsia="Calibri"/>
       <w:b/>
       <w:bCs/>
       <w:color w:val="000000"/>
-      <w:sz w:val="32"/>
-      <w:szCs w:val="32"/>
+      <w:sz w:val="24"/>
+      <w:szCs w:val="24"/>
     </w:rPr>
   </w:style>
   <w:style w:type="paragraph" w:styleId="Heading2">
@@ -765,12 +765,12 @@
       <w:outlineLvl w:val="1"/>
     </w:pPr>
     <w:rPr>
-      <w:rFonts w:ascii="Times New Roman" w:hAnsi="Times New Roman" w:cs="Times New Roman" w:eastAsia="Times New Roman"/>
+      <w:rFonts w:ascii="Calibri" w:hAnsi="Calibri" w:cs="Calibri" w:eastAsia="Calibri"/>
       <w:b/>
       <w:bCs/>
       <w:color w:val="000000"/>
-      <w:sz w:val="28"/>
-      <w:szCs w:val="28"/>
+      <w:sz w:val="22"/>
+      <w:szCs w:val="22"/>
     </w:rPr>
   </w:style>
   <w:style w:type="paragraph" w:styleId="Heading3">
@@ -787,12 +787,12 @@
       <w:outlineLvl w:val="2"/>
     </w:pPr>
     <w:rPr>
-      <w:rFonts w:ascii="Times New Roman" w:hAnsi="Times New Roman" w:cs="Times New Roman" w:eastAsia="Times New Roman"/>
+      <w:rFonts w:ascii="Calibri" w:hAnsi="Calibri" w:cs="Calibri" w:eastAsia="Calibri"/>
       <w:b/>
       <w:bCs/>
       <w:color w:val="000000"/>
-      <w:sz w:val="24"/>
-      <w:szCs w:val="24"/>
+      <w:sz w:val="22"/>
+      <w:szCs w:val="22"/>
     </w:rPr>
   </w:style>
   <w:style w:type="paragraph" w:styleId="Heading4">
@@ -809,12 +809,12 @@
       <w:outlineLvl w:val="3"/>
     </w:pPr>
     <w:rPr>
-      <w:rFonts w:ascii="Times New Roman" w:hAnsi="Times New Roman" w:cs="Times New Roman" w:eastAsia="Times New Roman"/>
+      <w:rFonts w:ascii="Calibri" w:hAnsi="Calibri" w:cs="Calibri" w:eastAsia="Calibri"/>
       <w:i/>
       <w:bCs/>
       <w:color w:val="000000"/>
-      <w:sz w:val="24"/>
-      <w:szCs w:val="24"/>
+      <w:sz w:val="22"/>
+      <w:szCs w:val="22"/>
     </w:rPr>
   </w:style>
   <w:style w:type="paragraph" w:styleId="Heading5">
@@ -831,11 +831,11 @@
       <w:outlineLvl w:val="4"/>
     </w:pPr>
     <w:rPr>
-      <w:rFonts w:ascii="Times New Roman" w:hAnsi="Times New Roman" w:cs="Times New Roman" w:eastAsia="Times New Roman"/>
+      <w:rFonts w:ascii="Calibri" w:hAnsi="Calibri" w:cs="Calibri" w:eastAsia="Calibri"/>
       <w:iCs/>
       <w:color w:val="000000"/>
-      <w:sz w:val="24"/>
-      <w:szCs w:val="24"/>
+      <w:sz w:val="22"/>
+      <w:szCs w:val="22"/>
     </w:rPr>
   </w:style>
   <w:style w:type="paragraph" w:styleId="Heading6">
@@ -852,10 +852,10 @@
       <w:outlineLvl w:val="5"/>
     </w:pPr>
     <w:rPr>
-      <w:rFonts w:ascii="Times New Roman" w:hAnsi="Times New Roman" w:cs="Times New Roman" w:eastAsia="Times New Roman"/>
-      <w:color w:val="000000"/>
-      <w:sz w:val="24"/>
-      <w:szCs w:val="24"/>
+      <w:rFonts w:ascii="Calibri" w:hAnsi="Calibri" w:cs="Calibri" w:eastAsia="Calibri"/>
+      <w:color w:val="000000"/>
+      <w:sz w:val="22"/>
+      <w:szCs w:val="22"/>
     </w:rPr>
   </w:style>
   <w:style w:type="paragraph" w:styleId="Heading7">
@@ -872,10 +872,10 @@
       <w:outlineLvl w:val="6"/>
     </w:pPr>
     <w:rPr>
-      <w:rFonts w:ascii="Times New Roman" w:hAnsi="Times New Roman" w:cs="Times New Roman" w:eastAsia="Times New Roman"/>
-      <w:color w:val="000000"/>
-      <w:sz w:val="24"/>
-      <w:szCs w:val="24"/>
+      <w:rFonts w:ascii="Calibri" w:hAnsi="Calibri" w:cs="Calibri" w:eastAsia="Calibri"/>
+      <w:color w:val="000000"/>
+      <w:sz w:val="22"/>
+      <w:szCs w:val="22"/>
     </w:rPr>
   </w:style>
   <w:style w:type="paragraph" w:styleId="Heading8">
@@ -892,10 +892,10 @@
       <w:outlineLvl w:val="7"/>
     </w:pPr>
     <w:rPr>
-      <w:rFonts w:ascii="Times New Roman" w:hAnsi="Times New Roman" w:cs="Times New Roman" w:eastAsia="Times New Roman"/>
-      <w:color w:val="000000"/>
-      <w:sz w:val="24"/>
-      <w:szCs w:val="24"/>
+      <w:rFonts w:ascii="Calibri" w:hAnsi="Calibri" w:cs="Calibri" w:eastAsia="Calibri"/>
+      <w:color w:val="000000"/>
+      <w:sz w:val="22"/>
+      <w:szCs w:val="22"/>
     </w:rPr>
   </w:style>
   <w:style w:type="paragraph" w:styleId="Heading9">
@@ -912,10 +912,10 @@
       <w:outlineLvl w:val="8"/>
     </w:pPr>
     <w:rPr>
-      <w:rFonts w:ascii="Times New Roman" w:hAnsi="Times New Roman" w:cs="Times New Roman" w:eastAsia="Times New Roman"/>
-      <w:color w:val="000000"/>
-      <w:sz w:val="24"/>
-      <w:szCs w:val="24"/>
+      <w:rFonts w:ascii="Calibri" w:hAnsi="Calibri" w:cs="Calibri" w:eastAsia="Calibri"/>
+      <w:color w:val="000000"/>
+      <w:sz w:val="22"/>
+      <w:szCs w:val="22"/>
     </w:rPr>
   </w:style>
   <w:style w:type="paragraph" w:styleId="BlockText">
@@ -926,13 +926,13 @@
     <w:unhideWhenUsed/>
     <w:qFormat/>
     <w:pPr>
-      <w:spacing w:before="0" w:after="120" w:line="480" w:lineRule="auto"/>
+      <w:spacing w:before="0" w:after="120" w:line="240" w:lineRule="auto"/>
       <w:ind w:firstLine="0" w:left="480" w:right="480"/>
     </w:pPr>
     <w:rPr>
-      <w:rFonts w:ascii="Times New Roman" w:hAnsi="Times New Roman" w:cs="Times New Roman" w:eastAsia="Times New Roman"/>
-      <w:color w:val="000000"/>
-      <w:sz w:val="24"/>
+      <w:rFonts w:ascii="Calibri" w:hAnsi="Calibri" w:cs="Calibri" w:eastAsia="Calibri"/>
+      <w:color w:val="000000"/>
+      <w:sz w:val="22"/>
     </w:rPr>
   </w:style>
   <w:style w:type="paragraph" w:styleId="FootnoteText">
@@ -943,7 +943,7 @@
     <w:unhideWhenUsed/>
     <w:qFormat/>
     <w:rPr>
-      <w:rFonts w:ascii="Times New Roman" w:hAnsi="Times New Roman" w:cs="Times New Roman" w:eastAsia="Times New Roman"/>
+      <w:rFonts w:ascii="Calibri" w:hAnsi="Calibri" w:cs="Calibri" w:eastAsia="Calibri"/>
       <w:color w:val="000000"/>
     </w:rPr>
   </w:style>
@@ -993,7 +993,7 @@
       <w:spacing w:after="0"/>
     </w:pPr>
     <w:rPr>
-      <w:rFonts w:ascii="Times New Roman" w:hAnsi="Times New Roman" w:cs="Times New Roman" w:eastAsia="Times New Roman"/>
+      <w:rFonts w:ascii="Calibri" w:hAnsi="Calibri" w:cs="Calibri" w:eastAsia="Calibri"/>
       <w:b/>
       <w:color w:val="000000"/>
     </w:rPr>
@@ -1002,7 +1002,7 @@
     <w:name w:val="Definition"/>
     <w:basedOn w:val="Normal"/>
     <w:rPr>
-      <w:rFonts w:ascii="Times New Roman" w:hAnsi="Times New Roman" w:cs="Times New Roman" w:eastAsia="Times New Roman"/>
+      <w:rFonts w:ascii="Calibri" w:hAnsi="Calibri" w:cs="Calibri" w:eastAsia="Calibri"/>
       <w:color w:val="000000"/>
     </w:rPr>
   </w:style>
@@ -1014,10 +1014,10 @@
       <w:spacing w:before="0" w:after="160" w:line="240" w:lineRule="auto"/>
     </w:pPr>
     <w:rPr>
-      <w:rFonts w:ascii="Times New Roman" w:hAnsi="Times New Roman" w:cs="Times New Roman" w:eastAsia="Times New Roman"/>
+      <w:rFonts w:ascii="Calibri" w:hAnsi="Calibri" w:cs="Calibri" w:eastAsia="Calibri"/>
       <w:i w:val="0"/>
       <w:color w:val="000000"/>
-      <w:sz w:val="22"/>
+      <w:sz w:val="20"/>
     </w:rPr>
   </w:style>
   <w:style w:type="paragraph" w:customStyle="1" w:styleId="TableCaption">
@@ -1028,10 +1028,10 @@
       <w:spacing w:line="240" w:lineRule="auto" w:after="160"/>
     </w:pPr>
     <w:rPr>
-      <w:rFonts w:ascii="Times New Roman" w:hAnsi="Times New Roman" w:cs="Times New Roman" w:eastAsia="Times New Roman"/>
+      <w:rFonts w:ascii="Calibri" w:hAnsi="Calibri" w:cs="Calibri" w:eastAsia="Calibri"/>
       <w:i w:val="0"/>
       <w:color w:val="000000"/>
-      <w:sz w:val="22"/>
+      <w:sz w:val="20"/>
     </w:rPr>
   </w:style>
   <w:style w:type="paragraph" w:customStyle="1" w:styleId="ImageCaption">
@@ -1041,17 +1041,17 @@
       <w:spacing w:line="240" w:lineRule="auto" w:after="160"/>
     </w:pPr>
     <w:rPr>
-      <w:rFonts w:ascii="Times New Roman" w:hAnsi="Times New Roman" w:cs="Times New Roman" w:eastAsia="Times New Roman"/>
+      <w:rFonts w:ascii="Calibri" w:hAnsi="Calibri" w:cs="Calibri" w:eastAsia="Calibri"/>
       <w:i w:val="0"/>
       <w:color w:val="000000"/>
-      <w:sz w:val="22"/>
+      <w:sz w:val="20"/>
     </w:rPr>
   </w:style>
   <w:style w:type="paragraph" w:customStyle="1" w:styleId="Figure">
     <w:name w:val="Figure"/>
     <w:basedOn w:val="Normal"/>
     <w:rPr>
-      <w:rFonts w:ascii="Times New Roman" w:hAnsi="Times New Roman" w:cs="Times New Roman" w:eastAsia="Times New Roman"/>
+      <w:rFonts w:ascii="Calibri" w:hAnsi="Calibri" w:cs="Calibri" w:eastAsia="Calibri"/>
       <w:color w:val="000000"/>
     </w:rPr>
   </w:style>
@@ -1062,7 +1062,7 @@
       <w:keepNext/>
     </w:pPr>
     <w:rPr>
-      <w:rFonts w:ascii="Times New Roman" w:hAnsi="Times New Roman" w:cs="Times New Roman" w:eastAsia="Times New Roman"/>
+      <w:rFonts w:ascii="Calibri" w:hAnsi="Calibri" w:cs="Calibri" w:eastAsia="Calibri"/>
       <w:color w:val="000000"/>
     </w:rPr>
   </w:style>
@@ -1076,7 +1076,7 @@
     <w:basedOn w:val="BodyTextChar"/>
     <w:rPr>
       <w:rFonts w:ascii="Consolas" w:hAnsi="Consolas"/>
-      <w:sz w:val="22"/>
+      <w:sz w:val="20"/>
     </w:rPr>
   </w:style>
   <w:style w:type="character" w:customStyle="1" w:styleId="SectionNumber">
@@ -1109,7 +1109,7 @@
       <w:outlineLvl w:val="9"/>
     </w:pPr>
     <w:rPr>
-      <w:rFonts w:ascii="Times New Roman" w:hAnsi="Times New Roman" w:cs="Times New Roman" w:eastAsia="Times New Roman"/>
+      <w:rFonts w:ascii="Calibri" w:hAnsi="Calibri" w:cs="Calibri" w:eastAsia="Calibri"/>
       <w:b w:val="0"/>
       <w:bCs w:val="0"/>
       <w:color w:val="000000"/>

</xml_diff>